<commit_message>
add filestorage, add reset password, store word instead of pdf
</commit_message>
<xml_diff>
--- a/public/projectplan_template.docx
+++ b/public/projectplan_template.docx
@@ -40,39 +40,17 @@
         <w:rPr>
           <w:b/>
           <w:i/>
-          <w:color w:val="000000"/>
           <w:sz w:val="28"/>
           <w:szCs w:val="28"/>
         </w:rPr>
       </w:pPr>
       <w:r>
-        <w:rPr>
-          <w:b/>
-          <w:i/>
-          <w:color w:val="000000"/>
-          <w:sz w:val="28"/>
-          <w:szCs w:val="28"/>
-        </w:rPr>
-        <w:t>[INSERT LOGO(S) OF THE PROJECT OPERATOR(S)]</w:t>
-      </w:r>
-    </w:p>
-    <w:p>
-      <w:pPr>
-        <w:jc w:val="center"/>
         <w:rPr>
           <w:b/>
           <w:i/>
           <w:sz w:val="28"/>
           <w:szCs w:val="28"/>
         </w:rPr>
-      </w:pPr>
-      <w:r>
-        <w:rPr>
-          <w:b/>
-          <w:i/>
-          <w:sz w:val="28"/>
-          <w:szCs w:val="28"/>
-        </w:rPr>
         <w:t>{projectTitle}</w:t>
       </w:r>
     </w:p>
@@ -92,24 +70,6 @@
           <w:szCs w:val="35"/>
         </w:rPr>
         <w:t>Project plan for long-term sequestration of CO2 in {buildingCategory}</w:t>
-      </w:r>
-    </w:p>
-    <w:p>
-      <w:pPr>
-        <w:jc w:val="center"/>
-        <w:rPr>
-          <w:b/>
-          <w:sz w:val="35"/>
-          <w:szCs w:val="35"/>
-        </w:rPr>
-      </w:pPr>
-    </w:p>
-    <w:p>
-      <w:pPr>
-        <w:jc w:val="center"/>
-      </w:pPr>
-      <w:r>
-        <w:t xml:space="preserve">[Picture of construction] </w:t>
       </w:r>
     </w:p>
     <w:p>
@@ -980,7 +940,6 @@
           <w:sz w:val="32"/>
           <w:szCs w:val="32"/>
         </w:rPr>
-        <w:lastRenderedPageBreak/>
         <w:t>Summary</w:t>
       </w:r>
     </w:p>
@@ -1014,7 +973,14 @@
         <w:rPr>
           <w:b/>
         </w:rPr>
-        <w:t xml:space="preserve"> Oncra Certification Protocol for Biobased Buildings v1.0</w:t>
+        <w:t xml:space="preserve"> Oncra Certification Protocol for Biobased </w:t>
+      </w:r>
+      <w:r>
+        <w:rPr>
+          <w:b/>
+        </w:rPr>
+        <w:lastRenderedPageBreak/>
+        <w:t>Buildings v1.0</w:t>
       </w:r>
       <w:r>
         <w:t xml:space="preserve">, this project plan does not address potential avoided or reduced emissions (substitution effects) by replacing traditional building materials and processes with biobased alternatives. The project plan concerns </w:t>
@@ -2137,27 +2103,7 @@
                 <w:sz w:val="19"/>
                 <w:szCs w:val="19"/>
               </w:rPr>
-              <w:t>{</w:t>
-            </w:r>
-            <w:proofErr w:type="spellStart"/>
-            <w:r>
-              <w:rPr>
-                <w:i/>
-                <w:color w:val="404040"/>
-                <w:sz w:val="19"/>
-                <w:szCs w:val="19"/>
-              </w:rPr>
-              <w:t>projectOperator</w:t>
-            </w:r>
-            <w:proofErr w:type="spellEnd"/>
-            <w:r>
-              <w:rPr>
-                <w:i/>
-                <w:color w:val="404040"/>
-                <w:sz w:val="19"/>
-                <w:szCs w:val="19"/>
-              </w:rPr>
-              <w:t>}</w:t>
+              <w:t>{projectOperator}</w:t>
             </w:r>
           </w:p>
         </w:tc>
@@ -3029,45 +2975,12 @@
       <w:bookmarkStart w:id="11" w:name="_heading=h.j4damkqm68yw" w:colFirst="0" w:colLast="0"/>
       <w:bookmarkEnd w:id="11"/>
       <w:r>
-        <w:t xml:space="preserve">Start project </w:t>
-      </w:r>
-      <w:r>
-        <w:t>{</w:t>
-      </w:r>
-      <w:proofErr w:type="spellStart"/>
-      <w:r>
-        <w:t>timeline</w:t>
-      </w:r>
-      <w:r>
-        <w:t>StartDate</w:t>
-      </w:r>
-      <w:proofErr w:type="spellEnd"/>
-      <w:r>
-        <w:t>}</w:t>
-      </w:r>
-    </w:p>
-    <w:p>
-      <w:proofErr w:type="spellStart"/>
-      <w:r>
-        <w:t>Afronding</w:t>
-      </w:r>
-      <w:proofErr w:type="spellEnd"/>
-      <w:r>
-        <w:t xml:space="preserve"> project: </w:t>
-      </w:r>
-      <w:r>
-        <w:t>{</w:t>
-      </w:r>
-      <w:proofErr w:type="spellStart"/>
-      <w:r>
-        <w:t>timeline</w:t>
-      </w:r>
-      <w:r>
-        <w:t>Enddate</w:t>
-      </w:r>
-      <w:proofErr w:type="spellEnd"/>
-      <w:r>
-        <w:t>}</w:t>
+        <w:t>Start project {timelineStartDate}</w:t>
+      </w:r>
+    </w:p>
+    <w:p>
+      <w:r>
+        <w:t>Afronding project: {timelineEnddate}</w:t>
       </w:r>
     </w:p>
     <w:p/>
@@ -3320,88 +3233,16 @@
       </w:r>
     </w:p>
     <w:p>
-      <w:pPr>
-        <w:rPr>
-          <w:highlight w:val="yellow"/>
-        </w:rPr>
-      </w:pPr>
-      <w:r>
-        <w:rPr>
-          <w:highlight w:val="yellow"/>
-        </w:rPr>
+      <w:r>
         <w:t>{baselineBuildingType}</w:t>
       </w:r>
     </w:p>
     <w:p>
       <w:pPr>
-        <w:numPr>
-          <w:ilvl w:val="0"/>
-          <w:numId w:val="2"/>
-        </w:numPr>
-        <w:spacing w:after="0" w:line="240" w:lineRule="auto"/>
-      </w:pPr>
-      <w:r>
-        <w:t>Residential, pitched roof</w:t>
-      </w:r>
-    </w:p>
-    <w:p>
-      <w:pPr>
-        <w:numPr>
-          <w:ilvl w:val="0"/>
-          <w:numId w:val="2"/>
-        </w:numPr>
-        <w:spacing w:after="0" w:line="240" w:lineRule="auto"/>
-      </w:pPr>
-      <w:r>
-        <w:t>Residential, flat roof</w:t>
-      </w:r>
-    </w:p>
-    <w:p>
-      <w:pPr>
-        <w:numPr>
-          <w:ilvl w:val="0"/>
-          <w:numId w:val="2"/>
-        </w:numPr>
-        <w:spacing w:after="0" w:line="240" w:lineRule="auto"/>
-      </w:pPr>
-      <w:r>
-        <w:t>Residential, stacked</w:t>
-      </w:r>
-    </w:p>
-    <w:p>
-      <w:pPr>
-        <w:numPr>
-          <w:ilvl w:val="0"/>
-          <w:numId w:val="2"/>
-        </w:numPr>
-        <w:spacing w:after="0" w:line="240" w:lineRule="auto"/>
-      </w:pPr>
-      <w:bookmarkStart w:id="17" w:name="_heading=h.1ksv4uv" w:colFirst="0" w:colLast="0"/>
+        <w:pStyle w:val="Kop3"/>
+      </w:pPr>
+      <w:bookmarkStart w:id="17" w:name="_heading=h.44sinio" w:colFirst="0" w:colLast="0"/>
       <w:bookmarkEnd w:id="17"/>
-      <w:r>
-        <w:t>Commercial, offices</w:t>
-      </w:r>
-    </w:p>
-    <w:p>
-      <w:pPr>
-        <w:numPr>
-          <w:ilvl w:val="0"/>
-          <w:numId w:val="2"/>
-        </w:numPr>
-        <w:spacing w:after="0" w:line="240" w:lineRule="auto"/>
-      </w:pPr>
-      <w:bookmarkStart w:id="18" w:name="_heading=h.h5wsoj143ewz" w:colFirst="0" w:colLast="0"/>
-      <w:bookmarkEnd w:id="18"/>
-      <w:r>
-        <w:t>Commercial, other</w:t>
-      </w:r>
-    </w:p>
-    <w:p>
-      <w:pPr>
-        <w:pStyle w:val="Kop3"/>
-      </w:pPr>
-      <w:bookmarkStart w:id="19" w:name="_heading=h.44sinio" w:colFirst="0" w:colLast="0"/>
-      <w:bookmarkEnd w:id="19"/>
       <w:r>
         <w:t>2.1.2</w:t>
       </w:r>
@@ -3815,8 +3656,8 @@
         <w:spacing w:before="240" w:after="240"/>
         <w:jc w:val="both"/>
       </w:pPr>
-      <w:bookmarkStart w:id="20" w:name="_heading=h.7r5vyaae66cc" w:colFirst="0" w:colLast="0"/>
-      <w:bookmarkEnd w:id="20"/>
+      <w:bookmarkStart w:id="18" w:name="_heading=h.7r5vyaae66cc" w:colFirst="0" w:colLast="0"/>
+      <w:bookmarkEnd w:id="18"/>
       <w:r>
         <w:t xml:space="preserve">2.1.3 </w:t>
       </w:r>
@@ -3841,11 +3682,7 @@
         <w:t>always</w:t>
       </w:r>
       <w:r>
-        <w:t xml:space="preserve"> lower than those of fossil-based alternatives. Therefore, in accordance with the version of the certification protocol used, there is no increase in greenhouse gas emissions compared to a conventional scenario. The greenhouse gas emissions resulting from the construction project are </w:t>
-      </w:r>
-      <w:r>
-        <w:lastRenderedPageBreak/>
-        <w:t>accounted for separately in the Environmental Performance of Buildings (MPG) calculation as per national legislation.</w:t>
+        <w:t xml:space="preserve"> lower than those of fossil-based alternatives. Therefore, in accordance with the version of the certification protocol used, there is no increase in greenhouse gas emissions compared to a conventional scenario. The greenhouse gas emissions resulting from the construction project are accounted for separately in the Environmental Performance of Buildings (MPG) calculation as per national legislation.</w:t>
       </w:r>
     </w:p>
     <w:p>
@@ -3872,9 +3709,10 @@
         <w:pStyle w:val="Kop3"/>
         <w:spacing w:before="240" w:after="240"/>
       </w:pPr>
-      <w:bookmarkStart w:id="21" w:name="_heading=h.lvu13itaaumk" w:colFirst="0" w:colLast="0"/>
-      <w:bookmarkEnd w:id="21"/>
-      <w:r>
+      <w:bookmarkStart w:id="19" w:name="_heading=h.lvu13itaaumk" w:colFirst="0" w:colLast="0"/>
+      <w:bookmarkEnd w:id="19"/>
+      <w:r>
+        <w:lastRenderedPageBreak/>
         <w:t>2.1.4 Result (Net Carbon Removal Benefit)</w:t>
       </w:r>
     </w:p>
@@ -4007,8 +3845,8 @@
         <w:pStyle w:val="Kop2"/>
         <w:spacing w:before="240" w:after="240"/>
       </w:pPr>
-      <w:bookmarkStart w:id="22" w:name="_heading=h.l4cx2eku51sn" w:colFirst="0" w:colLast="0"/>
-      <w:bookmarkEnd w:id="22"/>
+      <w:bookmarkStart w:id="20" w:name="_heading=h.l4cx2eku51sn" w:colFirst="0" w:colLast="0"/>
+      <w:bookmarkEnd w:id="20"/>
       <w:r>
         <w:t>Additionality</w:t>
       </w:r>
@@ -4068,8 +3906,8 @@
         <w:pStyle w:val="Kop2"/>
         <w:spacing w:before="240" w:after="240"/>
       </w:pPr>
-      <w:bookmarkStart w:id="23" w:name="_heading=h.k8jp6j9tciur" w:colFirst="0" w:colLast="0"/>
-      <w:bookmarkEnd w:id="23"/>
+      <w:bookmarkStart w:id="21" w:name="_heading=h.k8jp6j9tciur" w:colFirst="0" w:colLast="0"/>
+      <w:bookmarkEnd w:id="21"/>
       <w:r>
         <w:t>Lifespan</w:t>
       </w:r>
@@ -4125,8 +3963,8 @@
         <w:pStyle w:val="Kop2"/>
         <w:spacing w:before="240" w:after="240"/>
       </w:pPr>
-      <w:bookmarkStart w:id="24" w:name="_heading=h.igtvd0vsiwsp" w:colFirst="0" w:colLast="0"/>
-      <w:bookmarkEnd w:id="24"/>
+      <w:bookmarkStart w:id="22" w:name="_heading=h.igtvd0vsiwsp" w:colFirst="0" w:colLast="0"/>
+      <w:bookmarkEnd w:id="22"/>
       <w:r>
         <w:t>Sustainability</w:t>
       </w:r>
@@ -4191,7 +4029,6 @@
         <w:rPr>
           <w:i/>
         </w:rPr>
-        <w:lastRenderedPageBreak/>
         <w:t>Adaptation to Climate Change</w:t>
       </w:r>
     </w:p>
@@ -4238,6 +4075,7 @@
         <w:rPr>
           <w:i/>
         </w:rPr>
+        <w:lastRenderedPageBreak/>
         <w:t>Sustainable Use and Protection of Water and Marine Resources</w:t>
       </w:r>
     </w:p>
@@ -4425,8 +4263,8 @@
       <w:pPr>
         <w:pStyle w:val="Kop2"/>
       </w:pPr>
-      <w:bookmarkStart w:id="25" w:name="_heading=h.tozfjapwkhrf" w:colFirst="0" w:colLast="0"/>
-      <w:bookmarkEnd w:id="25"/>
+      <w:bookmarkStart w:id="23" w:name="_heading=h.tozfjapwkhrf" w:colFirst="0" w:colLast="0"/>
+      <w:bookmarkEnd w:id="23"/>
       <w:r>
         <w:t>Monitoring</w:t>
       </w:r>
@@ -4672,25 +4510,7 @@
                     <w:sz w:val="19"/>
                     <w:szCs w:val="19"/>
                   </w:rPr>
-                  <w:t>{</w:t>
-                </w:r>
-                <w:proofErr w:type="spellStart"/>
-                <w:r>
-                  <w:rPr>
-                    <w:rFonts w:ascii="PT Sans" w:eastAsia="PT Sans" w:hAnsi="PT Sans" w:cs="PT Sans"/>
-                    <w:sz w:val="19"/>
-                    <w:szCs w:val="19"/>
-                  </w:rPr>
-                  <w:t>evidence_used_biomaterials</w:t>
-                </w:r>
-                <w:proofErr w:type="spellEnd"/>
-                <w:r>
-                  <w:rPr>
-                    <w:rFonts w:ascii="PT Sans" w:eastAsia="PT Sans" w:hAnsi="PT Sans" w:cs="PT Sans"/>
-                    <w:sz w:val="19"/>
-                    <w:szCs w:val="19"/>
-                  </w:rPr>
-                  <w:t>}</w:t>
+                  <w:t>{evidence_used_biomaterials}</w:t>
                 </w:r>
               </w:p>
             </w:tc>
@@ -5013,33 +4833,7 @@
                     <w:sz w:val="19"/>
                     <w:szCs w:val="19"/>
                   </w:rPr>
-                  <w:t>{</w:t>
-                </w:r>
-                <w:proofErr w:type="spellStart"/>
-                <w:r>
-                  <w:rPr>
-                    <w:rFonts w:ascii="PT Sans" w:eastAsia="PT Sans" w:hAnsi="PT Sans" w:cs="PT Sans"/>
-                    <w:sz w:val="19"/>
-                    <w:szCs w:val="19"/>
-                  </w:rPr>
-                  <w:t>evidence_</w:t>
-                </w:r>
-                <w:r>
-                  <w:rPr>
-                    <w:rFonts w:ascii="PT Sans" w:eastAsia="PT Sans" w:hAnsi="PT Sans" w:cs="PT Sans"/>
-                    <w:sz w:val="19"/>
-                    <w:szCs w:val="19"/>
-                  </w:rPr>
-                  <w:t>building_lifespan</w:t>
-                </w:r>
-                <w:proofErr w:type="spellEnd"/>
-                <w:r>
-                  <w:rPr>
-                    <w:rFonts w:ascii="PT Sans" w:eastAsia="PT Sans" w:hAnsi="PT Sans" w:cs="PT Sans"/>
-                    <w:sz w:val="19"/>
-                    <w:szCs w:val="19"/>
-                  </w:rPr>
-                  <w:t>}</w:t>
+                  <w:t>{evidence_building_lifespan}</w:t>
                 </w:r>
               </w:p>
             </w:tc>
@@ -5116,33 +4910,7 @@
                     <w:sz w:val="19"/>
                     <w:szCs w:val="19"/>
                   </w:rPr>
-                  <w:t>{</w:t>
-                </w:r>
-                <w:proofErr w:type="spellStart"/>
-                <w:r>
-                  <w:rPr>
-                    <w:rFonts w:ascii="PT Sans" w:eastAsia="PT Sans" w:hAnsi="PT Sans" w:cs="PT Sans"/>
-                    <w:sz w:val="19"/>
-                    <w:szCs w:val="19"/>
-                  </w:rPr>
-                  <w:t>evidence_building_</w:t>
-                </w:r>
-                <w:r>
-                  <w:rPr>
-                    <w:rFonts w:ascii="PT Sans" w:eastAsia="PT Sans" w:hAnsi="PT Sans" w:cs="PT Sans"/>
-                    <w:sz w:val="19"/>
-                    <w:szCs w:val="19"/>
-                  </w:rPr>
-                  <w:t>permit</w:t>
-                </w:r>
-                <w:proofErr w:type="spellEnd"/>
-                <w:r>
-                  <w:rPr>
-                    <w:rFonts w:ascii="PT Sans" w:eastAsia="PT Sans" w:hAnsi="PT Sans" w:cs="PT Sans"/>
-                    <w:sz w:val="19"/>
-                    <w:szCs w:val="19"/>
-                  </w:rPr>
-                  <w:t>}</w:t>
+                  <w:t>{evidence_building_permit}</w:t>
                 </w:r>
               </w:p>
             </w:tc>
@@ -5219,41 +4987,7 @@
                     <w:sz w:val="19"/>
                     <w:szCs w:val="19"/>
                   </w:rPr>
-                  <w:t>{</w:t>
-                </w:r>
-                <w:proofErr w:type="spellStart"/>
-                <w:r>
-                  <w:rPr>
-                    <w:rFonts w:ascii="PT Sans" w:eastAsia="PT Sans" w:hAnsi="PT Sans" w:cs="PT Sans"/>
-                    <w:sz w:val="19"/>
-                    <w:szCs w:val="19"/>
-                  </w:rPr>
-                  <w:t>evidence_</w:t>
-                </w:r>
-                <w:r>
-                  <w:rPr>
-                    <w:rFonts w:ascii="PT Sans" w:eastAsia="PT Sans" w:hAnsi="PT Sans" w:cs="PT Sans"/>
-                    <w:sz w:val="19"/>
-                    <w:szCs w:val="19"/>
-                  </w:rPr>
-                  <w:t>wood</w:t>
-                </w:r>
-                <w:proofErr w:type="spellEnd"/>
-                <w:r>
-                  <w:rPr>
-                    <w:rFonts w:ascii="PT Sans" w:eastAsia="PT Sans" w:hAnsi="PT Sans" w:cs="PT Sans"/>
-                    <w:sz w:val="19"/>
-                    <w:szCs w:val="19"/>
-                  </w:rPr>
-                  <w:t>-sustainability</w:t>
-                </w:r>
-                <w:r>
-                  <w:rPr>
-                    <w:rFonts w:ascii="PT Sans" w:eastAsia="PT Sans" w:hAnsi="PT Sans" w:cs="PT Sans"/>
-                    <w:sz w:val="19"/>
-                    <w:szCs w:val="19"/>
-                  </w:rPr>
-                  <w:t>}</w:t>
+                  <w:t>{evidence_wood-sustainability}</w:t>
                 </w:r>
               </w:p>
             </w:tc>
@@ -5367,8 +5101,8 @@
       <w:pPr>
         <w:spacing w:after="0"/>
       </w:pPr>
-      <w:bookmarkStart w:id="26" w:name="_heading=h.ppka494in9bg" w:colFirst="0" w:colLast="0"/>
-      <w:bookmarkEnd w:id="26"/>
+      <w:bookmarkStart w:id="24" w:name="_heading=h.ppka494in9bg" w:colFirst="0" w:colLast="0"/>
+      <w:bookmarkEnd w:id="24"/>
     </w:p>
     <w:p>
       <w:pPr>
@@ -5866,8 +5600,8 @@
       <w:pPr>
         <w:pStyle w:val="Kop2"/>
       </w:pPr>
-      <w:bookmarkStart w:id="27" w:name="_heading=h.q2dvqeeja6bo" w:colFirst="0" w:colLast="0"/>
-      <w:bookmarkEnd w:id="27"/>
+      <w:bookmarkStart w:id="25" w:name="_heading=h.q2dvqeeja6bo" w:colFirst="0" w:colLast="0"/>
+      <w:bookmarkEnd w:id="25"/>
       <w:r>
         <w:lastRenderedPageBreak/>
         <w:t>Reporting</w:t>
@@ -5891,8 +5625,8 @@
       <w:pPr>
         <w:pStyle w:val="Kop2"/>
       </w:pPr>
-      <w:bookmarkStart w:id="28" w:name="_heading=h.i95u5arjk6kp" w:colFirst="0" w:colLast="0"/>
-      <w:bookmarkEnd w:id="28"/>
+      <w:bookmarkStart w:id="26" w:name="_heading=h.i95u5arjk6kp" w:colFirst="0" w:colLast="0"/>
+      <w:bookmarkEnd w:id="26"/>
       <w:r>
         <w:t>Verification</w:t>
       </w:r>
@@ -5907,8 +5641,8 @@
       <w:pPr>
         <w:pStyle w:val="Kop2"/>
       </w:pPr>
-      <w:bookmarkStart w:id="29" w:name="_heading=h.e3eg2dkp2rgs" w:colFirst="0" w:colLast="0"/>
-      <w:bookmarkEnd w:id="29"/>
+      <w:bookmarkStart w:id="27" w:name="_heading=h.e3eg2dkp2rgs" w:colFirst="0" w:colLast="0"/>
+      <w:bookmarkEnd w:id="27"/>
       <w:r>
         <w:t>Risks</w:t>
       </w:r>
@@ -5936,8 +5670,8 @@
           <w:szCs w:val="18"/>
         </w:rPr>
       </w:pPr>
-      <w:bookmarkStart w:id="30" w:name="_heading=h.4fir17qqttw9" w:colFirst="0" w:colLast="0"/>
-      <w:bookmarkEnd w:id="30"/>
+      <w:bookmarkStart w:id="28" w:name="_heading=h.4fir17qqttw9" w:colFirst="0" w:colLast="0"/>
+      <w:bookmarkEnd w:id="28"/>
       <w:r>
         <w:rPr>
           <w:b/>
@@ -6218,8 +5952,8 @@
           <w:b/>
         </w:rPr>
       </w:pPr>
-      <w:bookmarkStart w:id="31" w:name="_heading=h.1y810tw" w:colFirst="0" w:colLast="0"/>
-      <w:bookmarkEnd w:id="31"/>
+      <w:bookmarkStart w:id="29" w:name="_heading=h.1y810tw" w:colFirst="0" w:colLast="0"/>
+      <w:bookmarkEnd w:id="29"/>
       <w:r>
         <w:rPr>
           <w:b/>

</xml_diff>